<commit_message>
Chronological Aug 2 order, new flyers, red counselling highlight
God Experience Sunday and counselling art, dated events first, counselling called out in red.
</commit_message>
<xml_diff>
--- a/scripts/Announcement-Script-2026-08-02.docx
+++ b/scripts/Announcement-Script-2026-08-02.docx
@@ -132,11 +132,110 @@
       <w:r>
         <w:rPr>
           <w:rFonts w:ascii="Arial" w:hAnsi="Arial" w:eastAsia="Arial"/>
+          <w:b w:val="0"/>
+          <w:color w:val="000000"/>
+          <w:sz w:val="22"/>
+        </w:rPr>
+        <w:t xml:space="preserve">, first service </w:t>
+      </w:r>
+      <w:r>
+        <w:rPr>
+          <w:rFonts w:ascii="Arial" w:hAnsi="Arial" w:eastAsia="Arial"/>
           <w:b/>
           <w:color w:val="C00000"/>
           <w:sz w:val="22"/>
         </w:rPr>
-        <w:t>. Don't miss it.</w:t>
+        <w:t>8:15 AM</w:t>
+      </w:r>
+      <w:r>
+        <w:rPr>
+          <w:rFonts w:ascii="Arial" w:hAnsi="Arial" w:eastAsia="Arial"/>
+          <w:b w:val="0"/>
+          <w:color w:val="000000"/>
+          <w:sz w:val="22"/>
+        </w:rPr>
+        <w:t xml:space="preserve"> and second service </w:t>
+      </w:r>
+      <w:r>
+        <w:rPr>
+          <w:rFonts w:ascii="Arial" w:hAnsi="Arial" w:eastAsia="Arial"/>
+          <w:b/>
+          <w:color w:val="C00000"/>
+          <w:sz w:val="22"/>
+        </w:rPr>
+        <w:t>10:00 AM</w:t>
+      </w:r>
+      <w:r>
+        <w:rPr>
+          <w:rFonts w:ascii="Arial" w:hAnsi="Arial" w:eastAsia="Arial"/>
+          <w:b w:val="0"/>
+          <w:color w:val="000000"/>
+          <w:sz w:val="22"/>
+        </w:rPr>
+        <w:t xml:space="preserve"> at Nova Cinema, Novare Mall. </w:t>
+      </w:r>
+      <w:r>
+        <w:rPr>
+          <w:rFonts w:ascii="Arial" w:hAnsi="Arial" w:eastAsia="Arial"/>
+          <w:b/>
+          <w:color w:val="C00000"/>
+          <w:sz w:val="22"/>
+        </w:rPr>
+        <w:t>Don't miss it.</w:t>
+      </w:r>
+    </w:p>
+    <w:p>
+      <w:pPr>
+        <w:spacing w:before="40" w:after="40"/>
+      </w:pPr>
+      <w:r>
+        <w:rPr>
+          <w:rFonts w:ascii="Arial" w:hAnsi="Arial" w:eastAsia="Arial"/>
+          <w:color w:val="BFBFBF"/>
+          <w:sz w:val="16"/>
+        </w:rPr>
+        <w:t>────────────────────────────────────────────────────────────────────────</w:t>
+      </w:r>
+    </w:p>
+    <w:p>
+      <w:pPr>
+        <w:spacing w:before="200" w:after="120" w:line="240" w:lineRule="auto"/>
+      </w:pPr>
+      <w:r>
+        <w:rPr>
+          <w:rFonts w:ascii="Arial" w:hAnsi="Arial" w:eastAsia="Arial"/>
+          <w:b/>
+          <w:color w:val="C00000"/>
+          <w:sz w:val="22"/>
+        </w:rPr>
+        <w:t>KYC — Know Your Church</w:t>
+      </w:r>
+      <w:r>
+        <w:rPr>
+          <w:rFonts w:ascii="Arial" w:hAnsi="Arial" w:eastAsia="Arial"/>
+          <w:b w:val="0"/>
+          <w:color w:val="000000"/>
+          <w:sz w:val="22"/>
+        </w:rPr>
+        <w:t xml:space="preserve"> holds every 3rd Sunday (next around August 16th). Are you a guest or volunteer looking to become a registered member of this community? </w:t>
+      </w:r>
+      <w:r>
+        <w:rPr>
+          <w:rFonts w:ascii="Arial" w:hAnsi="Arial" w:eastAsia="Arial"/>
+          <w:b/>
+          <w:color w:val="C00000"/>
+          <w:sz w:val="22"/>
+        </w:rPr>
+        <w:t>Attend a KYC session</w:t>
+      </w:r>
+      <w:r>
+        <w:rPr>
+          <w:rFonts w:ascii="Arial" w:hAnsi="Arial" w:eastAsia="Arial"/>
+          <w:b w:val="0"/>
+          <w:color w:val="000000"/>
+          <w:sz w:val="22"/>
+        </w:rPr>
+        <w:t>.</w:t>
       </w:r>
     </w:p>
     <w:p>
@@ -217,7 +316,7 @@
           <w:color w:val="C00000"/>
           <w:sz w:val="22"/>
         </w:rPr>
-        <w:t>KYC — Know Your Church</w:t>
+        <w:t>Midweek:</w:t>
       </w:r>
       <w:r>
         <w:rPr>
@@ -226,7 +325,7 @@
           <w:color w:val="000000"/>
           <w:sz w:val="22"/>
         </w:rPr>
-        <w:t xml:space="preserve"> holds every 3rd Sunday. Are you a guest or volunteer looking to become a registered member of this community? </w:t>
+        <w:t xml:space="preserve"> Every Wednesday we </w:t>
       </w:r>
       <w:r>
         <w:rPr>
@@ -235,7 +334,7 @@
           <w:color w:val="C00000"/>
           <w:sz w:val="22"/>
         </w:rPr>
-        <w:t>Attend a KYC session</w:t>
+        <w:t>fast all through the day</w:t>
       </w:r>
       <w:r>
         <w:rPr>
@@ -244,7 +343,115 @@
           <w:color w:val="000000"/>
           <w:sz w:val="22"/>
         </w:rPr>
-        <w:t>.</w:t>
+        <w:t xml:space="preserve">, gather for </w:t>
+      </w:r>
+      <w:r>
+        <w:rPr>
+          <w:rFonts w:ascii="Arial" w:hAnsi="Arial" w:eastAsia="Arial"/>
+          <w:b/>
+          <w:color w:val="C00000"/>
+          <w:sz w:val="22"/>
+        </w:rPr>
+        <w:t>MidDay Declaration (1:00–1:30 PM)</w:t>
+      </w:r>
+      <w:r>
+        <w:rPr>
+          <w:rFonts w:ascii="Arial" w:hAnsi="Arial" w:eastAsia="Arial"/>
+          <w:b w:val="0"/>
+          <w:color w:val="000000"/>
+          <w:sz w:val="22"/>
+        </w:rPr>
+        <w:t xml:space="preserve">, and then </w:t>
+      </w:r>
+      <w:r>
+        <w:rPr>
+          <w:rFonts w:ascii="Arial" w:hAnsi="Arial" w:eastAsia="Arial"/>
+          <w:b/>
+          <w:color w:val="C00000"/>
+          <w:sz w:val="22"/>
+        </w:rPr>
+        <w:t>6:18!</w:t>
+      </w:r>
+      <w:r>
+        <w:rPr>
+          <w:rFonts w:ascii="Arial" w:hAnsi="Arial" w:eastAsia="Arial"/>
+          <w:b w:val="0"/>
+          <w:color w:val="000000"/>
+          <w:sz w:val="22"/>
+        </w:rPr>
+        <w:t xml:space="preserve"> goes live at 6:18 PM on the LifePointe YouTube page. The service link will be shared every Wednesday on the Light Up group.</w:t>
+      </w:r>
+    </w:p>
+    <w:p>
+      <w:pPr>
+        <w:spacing w:before="40" w:after="40"/>
+      </w:pPr>
+      <w:r>
+        <w:rPr>
+          <w:rFonts w:ascii="Arial" w:hAnsi="Arial" w:eastAsia="Arial"/>
+          <w:color w:val="BFBFBF"/>
+          <w:sz w:val="16"/>
+        </w:rPr>
+        <w:t>────────────────────────────────────────────────────────────────────────</w:t>
+      </w:r>
+    </w:p>
+    <w:p>
+      <w:pPr>
+        <w:spacing w:before="200" w:after="120" w:line="240" w:lineRule="auto"/>
+      </w:pPr>
+      <w:r>
+        <w:rPr>
+          <w:rFonts w:ascii="Arial" w:hAnsi="Arial" w:eastAsia="Arial"/>
+          <w:b/>
+          <w:color w:val="C00000"/>
+          <w:sz w:val="22"/>
+        </w:rPr>
+        <w:t>Friday Prayer:</w:t>
+      </w:r>
+      <w:r>
+        <w:rPr>
+          <w:rFonts w:ascii="Arial" w:hAnsi="Arial" w:eastAsia="Arial"/>
+          <w:b w:val="0"/>
+          <w:color w:val="000000"/>
+          <w:sz w:val="22"/>
+        </w:rPr>
+        <w:t xml:space="preserve"> We meet </w:t>
+      </w:r>
+      <w:r>
+        <w:rPr>
+          <w:rFonts w:ascii="Arial" w:hAnsi="Arial" w:eastAsia="Arial"/>
+          <w:b/>
+          <w:color w:val="C00000"/>
+          <w:sz w:val="22"/>
+        </w:rPr>
+        <w:t>every Friday at 9:00 PM</w:t>
+      </w:r>
+      <w:r>
+        <w:rPr>
+          <w:rFonts w:ascii="Arial" w:hAnsi="Arial" w:eastAsia="Arial"/>
+          <w:b w:val="0"/>
+          <w:color w:val="000000"/>
+          <w:sz w:val="22"/>
+        </w:rPr>
+        <w:t xml:space="preserve"> to pray. If you have a prayer request, kindly </w:t>
+      </w:r>
+      <w:r>
+        <w:rPr>
+          <w:rFonts w:ascii="Arial" w:hAnsi="Arial" w:eastAsia="Arial"/>
+          <w:b/>
+          <w:color w:val="C00000"/>
+          <w:sz w:val="22"/>
+        </w:rPr>
+        <w:t>scan the QR code</w:t>
+      </w:r>
+      <w:r>
+        <w:rPr>
+          <w:rFonts w:ascii="Arial" w:hAnsi="Arial" w:eastAsia="Arial"/>
+          <w:b w:val="0"/>
+          <w:color w:val="000000"/>
+          <w:sz w:val="22"/>
+        </w:rPr>
+        <w:t xml:space="preserve"> and send your request.</w:t>
       </w:r>
     </w:p>
     <w:p>
@@ -442,7 +649,16 @@
           <w:color w:val="C00000"/>
           <w:sz w:val="22"/>
         </w:rPr>
-        <w:t>Midweek:</w:t>
+        <w:t>Counselling:</w:t>
+      </w:r>
+      <w:r>
+        <w:rPr>
+          <w:rFonts w:ascii="Arial" w:hAnsi="Arial" w:eastAsia="Arial"/>
+          <w:b/>
+          <w:color w:val="C00000"/>
+          <w:sz w:val="22"/>
+        </w:rPr>
+        <w:t xml:space="preserve"> Need someone to talk to? You're not alone. </w:t>
       </w:r>
       <w:r>
         <w:rPr>
@@ -451,97 +667,7 @@
           <w:color w:val="000000"/>
           <w:sz w:val="22"/>
         </w:rPr>
-        <w:t xml:space="preserve"> Every Wednesday we </w:t>
-      </w:r>
-      <w:r>
-        <w:rPr>
-          <w:rFonts w:ascii="Arial" w:hAnsi="Arial" w:eastAsia="Arial"/>
-          <w:b/>
-          <w:color w:val="C00000"/>
-          <w:sz w:val="22"/>
-        </w:rPr>
-        <w:t>fast all through the day</w:t>
-      </w:r>
-      <w:r>
-        <w:rPr>
-          <w:rFonts w:ascii="Arial" w:hAnsi="Arial" w:eastAsia="Arial"/>
-          <w:b w:val="0"/>
-          <w:color w:val="000000"/>
-          <w:sz w:val="22"/>
-        </w:rPr>
-        <w:t xml:space="preserve">, gather for </w:t>
-      </w:r>
-      <w:r>
-        <w:rPr>
-          <w:rFonts w:ascii="Arial" w:hAnsi="Arial" w:eastAsia="Arial"/>
-          <w:b/>
-          <w:color w:val="C00000"/>
-          <w:sz w:val="22"/>
-        </w:rPr>
-        <w:t>MidDay Declaration (1:00–1:30 PM)</w:t>
-      </w:r>
-      <w:r>
-        <w:rPr>
-          <w:rFonts w:ascii="Arial" w:hAnsi="Arial" w:eastAsia="Arial"/>
-          <w:b w:val="0"/>
-          <w:color w:val="000000"/>
-          <w:sz w:val="22"/>
-        </w:rPr>
-        <w:t xml:space="preserve">, and then </w:t>
-      </w:r>
-      <w:r>
-        <w:rPr>
-          <w:rFonts w:ascii="Arial" w:hAnsi="Arial" w:eastAsia="Arial"/>
-          <w:b/>
-          <w:color w:val="C00000"/>
-          <w:sz w:val="22"/>
-        </w:rPr>
-        <w:t>6:18!</w:t>
-      </w:r>
-      <w:r>
-        <w:rPr>
-          <w:rFonts w:ascii="Arial" w:hAnsi="Arial" w:eastAsia="Arial"/>
-          <w:b w:val="0"/>
-          <w:color w:val="000000"/>
-          <w:sz w:val="22"/>
-        </w:rPr>
-        <w:t xml:space="preserve"> goes live at 6:18 PM on the LifePointe YouTube page. The service link will be shared every Wednesday on the Light Up group.</w:t>
-      </w:r>
-    </w:p>
-    <w:p>
-      <w:pPr>
-        <w:spacing w:before="40" w:after="40"/>
-      </w:pPr>
-      <w:r>
-        <w:rPr>
-          <w:rFonts w:ascii="Arial" w:hAnsi="Arial" w:eastAsia="Arial"/>
-          <w:color w:val="BFBFBF"/>
-          <w:sz w:val="16"/>
-        </w:rPr>
-        <w:t>────────────────────────────────────────────────────────────────────────</w:t>
-      </w:r>
-    </w:p>
-    <w:p>
-      <w:pPr>
-        <w:spacing w:before="200" w:after="120" w:line="240" w:lineRule="auto"/>
-      </w:pPr>
-      <w:r>
-        <w:rPr>
-          <w:rFonts w:ascii="Arial" w:hAnsi="Arial" w:eastAsia="Arial"/>
-          <w:b/>
-          <w:color w:val="C00000"/>
-          <w:sz w:val="22"/>
-        </w:rPr>
-        <w:t>Counselling:</w:t>
-      </w:r>
-      <w:r>
-        <w:rPr>
-          <w:rFonts w:ascii="Arial" w:hAnsi="Arial" w:eastAsia="Arial"/>
-          <w:b w:val="0"/>
-          <w:color w:val="000000"/>
-          <w:sz w:val="22"/>
-        </w:rPr>
-        <w:t xml:space="preserve"> Do you need to speak to someone who will just listen? Kindly </w:t>
+        <w:t xml:space="preserve">Do you need to speak to someone who will just listen? Kindly </w:t>
       </w:r>
       <w:r>
         <w:rPr>
@@ -555,83 +681,11 @@
       <w:r>
         <w:rPr>
           <w:rFonts w:ascii="Arial" w:hAnsi="Arial" w:eastAsia="Arial"/>
-          <w:b w:val="0"/>
-          <w:color w:val="000000"/>
-          <w:sz w:val="22"/>
-        </w:rPr>
-        <w:t xml:space="preserve"> to speak with someone.</w:t>
-      </w:r>
-    </w:p>
-    <w:p>
-      <w:pPr>
-        <w:spacing w:before="40" w:after="40"/>
-      </w:pPr>
-      <w:r>
-        <w:rPr>
-          <w:rFonts w:ascii="Arial" w:hAnsi="Arial" w:eastAsia="Arial"/>
-          <w:color w:val="BFBFBF"/>
-          <w:sz w:val="16"/>
-        </w:rPr>
-        <w:t>────────────────────────────────────────────────────────────────────────</w:t>
-      </w:r>
-    </w:p>
-    <w:p>
-      <w:pPr>
-        <w:spacing w:before="200" w:after="120" w:line="240" w:lineRule="auto"/>
-      </w:pPr>
-      <w:r>
-        <w:rPr>
-          <w:rFonts w:ascii="Arial" w:hAnsi="Arial" w:eastAsia="Arial"/>
           <w:b/>
           <w:color w:val="C00000"/>
           <w:sz w:val="22"/>
         </w:rPr>
-        <w:t>Friday Prayer:</w:t>
-      </w:r>
-      <w:r>
-        <w:rPr>
-          <w:rFonts w:ascii="Arial" w:hAnsi="Arial" w:eastAsia="Arial"/>
-          <w:b w:val="0"/>
-          <w:color w:val="000000"/>
-          <w:sz w:val="22"/>
-        </w:rPr>
-        <w:t xml:space="preserve"> We meet </w:t>
-      </w:r>
-      <w:r>
-        <w:rPr>
-          <w:rFonts w:ascii="Arial" w:hAnsi="Arial" w:eastAsia="Arial"/>
-          <w:b/>
-          <w:color w:val="C00000"/>
-          <w:sz w:val="22"/>
-        </w:rPr>
-        <w:t>every Friday at 9:00 PM</w:t>
-      </w:r>
-      <w:r>
-        <w:rPr>
-          <w:rFonts w:ascii="Arial" w:hAnsi="Arial" w:eastAsia="Arial"/>
-          <w:b w:val="0"/>
-          <w:color w:val="000000"/>
-          <w:sz w:val="22"/>
-        </w:rPr>
-        <w:t xml:space="preserve"> to pray. If you have a prayer request, kindly </w:t>
-      </w:r>
-      <w:r>
-        <w:rPr>
-          <w:rFonts w:ascii="Arial" w:hAnsi="Arial" w:eastAsia="Arial"/>
-          <w:b/>
-          <w:color w:val="C00000"/>
-          <w:sz w:val="22"/>
-        </w:rPr>
-        <w:t>scan the QR code</w:t>
-      </w:r>
-      <w:r>
-        <w:rPr>
-          <w:rFonts w:ascii="Arial" w:hAnsi="Arial" w:eastAsia="Arial"/>
-          <w:b w:val="0"/>
-          <w:color w:val="000000"/>
-          <w:sz w:val="22"/>
-        </w:rPr>
-        <w:t xml:space="preserve"> and send your request.</w:t>
+        <w:t xml:space="preserve"> to get in touch with us.</w:t>
       </w:r>
     </w:p>
     <w:p>

</xml_diff>

<commit_message>
Add Tech & Data team card with WhatsApp join link
</commit_message>
<xml_diff>
--- a/scripts/Announcement-Script-2026-08-02.docx
+++ b/scripts/Announcement-Script-2026-08-02.docx
@@ -604,6 +604,60 @@
           <w:color w:val="C00000"/>
           <w:sz w:val="22"/>
         </w:rPr>
+        <w:t>Tech &amp; Data Team:</w:t>
+      </w:r>
+      <w:r>
+        <w:rPr>
+          <w:rFonts w:ascii="Arial" w:hAnsi="Arial" w:eastAsia="Arial"/>
+          <w:b w:val="0"/>
+          <w:color w:val="000000"/>
+          <w:sz w:val="22"/>
+        </w:rPr>
+        <w:t xml:space="preserve"> Three ways in, one team — train with us, build with us, or serve with us on Sundays. Scan the QR or join the WhatsApp group at </w:t>
+      </w:r>
+      <w:r>
+        <w:rPr>
+          <w:rFonts w:ascii="Arial" w:hAnsi="Arial" w:eastAsia="Arial"/>
+          <w:b/>
+          <w:color w:val="C00000"/>
+          <w:sz w:val="22"/>
+        </w:rPr>
+        <w:t>chat.whatsapp.com/EulpzYNzMnyESiMgEMrNL6</w:t>
+      </w:r>
+      <w:r>
+        <w:rPr>
+          <w:rFonts w:ascii="Arial" w:hAnsi="Arial" w:eastAsia="Arial"/>
+          <w:b w:val="0"/>
+          <w:color w:val="000000"/>
+          <w:sz w:val="22"/>
+        </w:rPr>
+        <w:t>. Come as you are, grow as you serve.</w:t>
+      </w:r>
+    </w:p>
+    <w:p>
+      <w:pPr>
+        <w:spacing w:before="40" w:after="40"/>
+      </w:pPr>
+      <w:r>
+        <w:rPr>
+          <w:rFonts w:ascii="Arial" w:hAnsi="Arial" w:eastAsia="Arial"/>
+          <w:color w:val="BFBFBF"/>
+          <w:sz w:val="16"/>
+        </w:rPr>
+        <w:t>────────────────────────────────────────────────────────────────────────</w:t>
+      </w:r>
+    </w:p>
+    <w:p>
+      <w:pPr>
+        <w:spacing w:before="200" w:after="120" w:line="240" w:lineRule="auto"/>
+      </w:pPr>
+      <w:r>
+        <w:rPr>
+          <w:rFonts w:ascii="Arial" w:hAnsi="Arial" w:eastAsia="Arial"/>
+          <w:b/>
+          <w:color w:val="C00000"/>
+          <w:sz w:val="22"/>
+        </w:rPr>
         <w:t>Church Project:</w:t>
       </w:r>
       <w:r>

</xml_diff>

<commit_message>
Tighten Tech & Data script line for Sunday read-through
</commit_message>
<xml_diff>
--- a/scripts/Announcement-Script-2026-08-02.docx
+++ b/scripts/Announcement-Script-2026-08-02.docx
@@ -613,7 +613,7 @@
           <w:color w:val="000000"/>
           <w:sz w:val="22"/>
         </w:rPr>
-        <w:t xml:space="preserve"> Three ways in, one team — train with us, build with us, or serve with us on Sundays. Scan the QR or join the WhatsApp group at </w:t>
+        <w:t xml:space="preserve"> Three ways in, one team — train with us, build with us, or serve with us on Sundays. </w:t>
       </w:r>
       <w:r>
         <w:rPr>
@@ -622,7 +622,7 @@
           <w:color w:val="C00000"/>
           <w:sz w:val="22"/>
         </w:rPr>
-        <w:t>chat.whatsapp.com/EulpzYNzMnyESiMgEMrNL6</w:t>
+        <w:t>Scan the QR to join the WhatsApp group.</w:t>
       </w:r>
       <w:r>
         <w:rPr>
@@ -631,7 +631,7 @@
           <w:color w:val="000000"/>
           <w:sz w:val="22"/>
         </w:rPr>
-        <w:t>. Come as you are, grow as you serve.</w:t>
+        <w:t xml:space="preserve"> Come as you are, grow as you serve.</w:t>
       </w:r>
     </w:p>
     <w:p>

</xml_diff>

<commit_message>
Add guest welcome and Psalm 1 closing charge to Aug 2 script
</commit_message>
<xml_diff>
--- a/scripts/Announcement-Script-2026-08-02.docx
+++ b/scripts/Announcement-Script-2026-08-02.docx
@@ -15,6 +15,114 @@
           <w:sz w:val="22"/>
         </w:rPr>
         <w:t>Sunday, August 2nd Announcements — Thanksgiving Sunday</w:t>
+      </w:r>
+    </w:p>
+    <w:p>
+      <w:pPr>
+        <w:spacing w:before="200" w:after="120" w:line="240" w:lineRule="auto"/>
+      </w:pPr>
+      <w:r>
+        <w:rPr>
+          <w:rFonts w:ascii="Arial" w:hAnsi="Arial" w:eastAsia="Arial"/>
+          <w:b/>
+          <w:color w:val="C00000"/>
+          <w:sz w:val="22"/>
+        </w:rPr>
+        <w:t>Welcome, guests.</w:t>
+      </w:r>
+      <w:r>
+        <w:rPr>
+          <w:rFonts w:ascii="Arial" w:hAnsi="Arial" w:eastAsia="Arial"/>
+          <w:b w:val="0"/>
+          <w:color w:val="000000"/>
+          <w:sz w:val="22"/>
+        </w:rPr>
+        <w:t xml:space="preserve"> If today is your first time, thank you for joining us. We are grateful to God for bringing you to us today. We are glad to have you worship with us today.</w:t>
+      </w:r>
+    </w:p>
+    <w:p>
+      <w:pPr>
+        <w:spacing w:before="40" w:after="40"/>
+      </w:pPr>
+      <w:r>
+        <w:rPr>
+          <w:rFonts w:ascii="Arial" w:hAnsi="Arial" w:eastAsia="Arial"/>
+          <w:color w:val="BFBFBF"/>
+          <w:sz w:val="16"/>
+        </w:rPr>
+        <w:t>────────────────────────────────────────────────────────────────────────</w:t>
+      </w:r>
+    </w:p>
+    <w:p>
+      <w:pPr>
+        <w:spacing w:before="200" w:after="120" w:line="240" w:lineRule="auto"/>
+      </w:pPr>
+      <w:r>
+        <w:rPr>
+          <w:rFonts w:ascii="Arial" w:hAnsi="Arial" w:eastAsia="Arial"/>
+          <w:b/>
+          <w:color w:val="C00000"/>
+          <w:sz w:val="22"/>
+        </w:rPr>
+        <w:t>First service:</w:t>
+      </w:r>
+      <w:r>
+        <w:rPr>
+          <w:rFonts w:ascii="Arial" w:hAnsi="Arial" w:eastAsia="Arial"/>
+          <w:b w:val="0"/>
+          <w:color w:val="000000"/>
+          <w:sz w:val="22"/>
+        </w:rPr>
+        <w:t xml:space="preserve"> Please follow the guest team, who will welcome you fully.</w:t>
+      </w:r>
+    </w:p>
+    <w:p>
+      <w:pPr>
+        <w:spacing w:before="40" w:after="40"/>
+      </w:pPr>
+      <w:r>
+        <w:rPr>
+          <w:rFonts w:ascii="Arial" w:hAnsi="Arial" w:eastAsia="Arial"/>
+          <w:color w:val="BFBFBF"/>
+          <w:sz w:val="16"/>
+        </w:rPr>
+        <w:t>────────────────────────────────────────────────────────────────────────</w:t>
+      </w:r>
+    </w:p>
+    <w:p>
+      <w:pPr>
+        <w:spacing w:before="200" w:after="120" w:line="240" w:lineRule="auto"/>
+      </w:pPr>
+      <w:r>
+        <w:rPr>
+          <w:rFonts w:ascii="Arial" w:hAnsi="Arial" w:eastAsia="Arial"/>
+          <w:b/>
+          <w:color w:val="C00000"/>
+          <w:sz w:val="22"/>
+        </w:rPr>
+        <w:t>Second service:</w:t>
+      </w:r>
+      <w:r>
+        <w:rPr>
+          <w:rFonts w:ascii="Arial" w:hAnsi="Arial" w:eastAsia="Arial"/>
+          <w:b w:val="0"/>
+          <w:color w:val="000000"/>
+          <w:sz w:val="22"/>
+        </w:rPr>
+        <w:t xml:space="preserve"> Please take your seat in the front row.</w:t>
+      </w:r>
+    </w:p>
+    <w:p>
+      <w:pPr>
+        <w:spacing w:before="40" w:after="40"/>
+      </w:pPr>
+      <w:r>
+        <w:rPr>
+          <w:rFonts w:ascii="Arial" w:hAnsi="Arial" w:eastAsia="Arial"/>
+          <w:color w:val="BFBFBF"/>
+          <w:sz w:val="16"/>
+        </w:rPr>
+        <w:t>────────────────────────────────────────────────────────────────────────</w:t>
       </w:r>
     </w:p>
     <w:p>
@@ -1012,6 +1120,69 @@
         <w:t xml:space="preserve"> A relaxed chance to connect with the community, make friends, and grow together.</w:t>
       </w:r>
     </w:p>
+    <w:p>
+      <w:pPr>
+        <w:spacing w:before="40" w:after="40"/>
+      </w:pPr>
+      <w:r>
+        <w:rPr>
+          <w:rFonts w:ascii="Arial" w:hAnsi="Arial" w:eastAsia="Arial"/>
+          <w:color w:val="BFBFBF"/>
+          <w:sz w:val="16"/>
+        </w:rPr>
+        <w:t>────────────────────────────────────────────────────────────────────────</w:t>
+      </w:r>
+    </w:p>
+    <w:p>
+      <w:pPr>
+        <w:spacing w:before="200" w:after="120" w:line="240" w:lineRule="auto"/>
+      </w:pPr>
+      <w:r>
+        <w:rPr>
+          <w:rFonts w:ascii="Arial" w:hAnsi="Arial" w:eastAsia="Arial"/>
+          <w:b/>
+          <w:color w:val="C00000"/>
+          <w:sz w:val="22"/>
+        </w:rPr>
+        <w:t>As we close the service, let's take the closing charge.</w:t>
+      </w:r>
+    </w:p>
+    <w:p>
+      <w:pPr>
+        <w:spacing w:before="40" w:after="40"/>
+      </w:pPr>
+      <w:r>
+        <w:rPr>
+          <w:rFonts w:ascii="Arial" w:hAnsi="Arial" w:eastAsia="Arial"/>
+          <w:color w:val="BFBFBF"/>
+          <w:sz w:val="16"/>
+        </w:rPr>
+        <w:t>────────────────────────────────────────────────────────────────────────</w:t>
+      </w:r>
+    </w:p>
+    <w:p>
+      <w:pPr>
+        <w:spacing w:before="200" w:after="120" w:line="240" w:lineRule="auto"/>
+      </w:pPr>
+      <w:r>
+        <w:rPr>
+          <w:rFonts w:ascii="Arial" w:hAnsi="Arial" w:eastAsia="Arial"/>
+          <w:b/>
+          <w:color w:val="C00000"/>
+          <w:sz w:val="22"/>
+        </w:rPr>
+        <w:t>Psalm 1:1–3</w:t>
+      </w:r>
+      <w:r>
+        <w:rPr>
+          <w:rFonts w:ascii="Arial" w:hAnsi="Arial" w:eastAsia="Arial"/>
+          <w:b w:val="0"/>
+          <w:color w:val="000000"/>
+          <w:sz w:val="22"/>
+        </w:rPr>
+        <w:t xml:space="preserve"> — Blessed is the man that walketh not in the counsel of the ungodly, nor standeth in the way of sinners, nor sitteth in the seat of the scornful. But his delight is in the law of the Lord; and in his law doth he meditate day and night. And he shall be like a tree planted by the rivers of water, that bringeth forth his fruit in his season; his leaf also shall not wither; and whatsoever he doeth shall prosper.</w:t>
+      </w:r>
+    </w:p>
     <w:sectPr>
       <w:pgSz w:w="12240" w:h="15840"/>
       <w:pgMar w:top="1440" w:right="1440" w:bottom="1440" w:left="1440" w:header="720" w:footer="720" w:gutter="0"/>

</xml_diff>